<commit_message>
feat(v3-7): integrate docx passthrough dispatch into c_mode_run
c_mode_run.run_part 在 jinja build/fill 之前插入分流:
1. 读 intermediate.json 数 type='variable' 的 blocks(避免 passthrough_part 在
   variables.yaml 不存在时默认 n_vars=0 漏判变量超阈 part)
2. 变量数 > 5 直接走 jinja
3. 变量数 ≤ 5 调 passthrough_part:
   - status=ok → 完成,return(不走 jinja)
   - status=error → return error
   - status=skipped → 显示跳过原因,fallthrough jinja
4. 日志区分 "docx 直切完成" / "docx 直切跳过" / "jinja 模板填充" 三种 tag

不补 unit test(分流 ≤10 行,demo 端到端覆盖更有意义,plan §3 已说明)。

demo 验证(C1+C2+C3):c_mode_run --all 跑 6 个 C 模式 Part,
- 4 个走 passthrough(Parts 0/4/5/6,变量数 3/4/4/4)
- 2 个走 jinja(Parts 1/2,变量数 9/7)
- 6 个 filled.docx 全部产出,日志清晰区分两条路径
- demo 产物同步入库,反映 V3-7 dispatch 后的 demo 真实状态
</commit_message>
<xml_diff>
--- a/projects/demo_cadre_training/output/c_mode/不参与围标串标承诺书/filled.docx
+++ b/projects/demo_cadre_training/output/c_mode/不参与围标串标承诺书/filled.docx
@@ -2,56 +2,70 @@
 <file path=word/document.xml><?xml version="1.0" encoding="utf-8"?>
 <w:document xmlns:wpc="http://schemas.microsoft.com/office/word/2010/wordprocessingCanvas" xmlns:mo="http://schemas.microsoft.com/office/mac/office/2008/main" xmlns:mc="http://schemas.openxmlformats.org/markup-compatibility/2006" xmlns:mv="urn:schemas-microsoft-com:mac:vml" xmlns:o="urn:schemas-microsoft-com:office:office" xmlns:r="http://schemas.openxmlformats.org/officeDocument/2006/relationships" xmlns:m="http://schemas.openxmlformats.org/officeDocument/2006/math" xmlns:v="urn:schemas-microsoft-com:vml" xmlns:wp14="http://schemas.microsoft.com/office/word/2010/wordprocessingDrawing" xmlns:wp="http://schemas.openxmlformats.org/drawingml/2006/wordprocessingDrawing" xmlns:w10="urn:schemas-microsoft-com:office:word" xmlns:w="http://schemas.openxmlformats.org/wordprocessingml/2006/main" xmlns:w14="http://schemas.microsoft.com/office/word/2010/wordml" xmlns:wpg="http://schemas.microsoft.com/office/word/2010/wordprocessingGroup" xmlns:wpi="http://schemas.microsoft.com/office/word/2010/wordprocessingInk" xmlns:wne="http://schemas.microsoft.com/office/word/2006/wordml" xmlns:wps="http://schemas.microsoft.com/office/word/2010/wordprocessingShape" mc:Ignorable="w14 wp14">
   <w:body>
-    <w:p>
-      <w:r>
-        <w:t>(四)不参与围标串标承诺书</w:t>
-      </w:r>
-    </w:p>
-    <w:p>
-      <w:r>
-        <w:t xml:space="preserve">本人作为 示例科技有限公司 的法人,承诺本项目投标活动不存在围标串标行为。</w:t>
-      </w:r>
-    </w:p>
-    <w:p>
-      <w:r>
-        <w:t>项目编号:DEMO-2026-001</w:t>
-      </w:r>
-    </w:p>
-    <w:p>
-      <w:r>
-        <w:t xml:space="preserve">供应商(电子签章):示例科技有限公司</w:t>
-      </w:r>
-    </w:p>
-    <w:p>
-      <w:r>
-        <w:t>法定代表人(电子签名):</w:t>
-      </w:r>
-      <w:r>
-        <w:rPr>
-          <w:color w:val="FF0000"/>
-          <w:b/>
-        </w:rPr>
-        <w:t xml:space="preserve">【待填:法代】</w:t>
-      </w:r>
-    </w:p>
-    <w:p>
-      <w:r>
-        <w:t>日期:</w:t>
-      </w:r>
-      <w:r>
-        <w:rPr>
-          <w:color w:val="FF0000"/>
-          <w:b/>
-        </w:rPr>
-        <w:t xml:space="preserve">【待填:日期】</w:t>
-      </w:r>
-    </w:p>
     <w:sectPr>
       <w:pgSz w:w="12240" w:h="15840"/>
       <w:pgMar w:top="1440" w:right="1800" w:bottom="1440" w:left="1800" w:header="720" w:footer="720" w:gutter="0"/>
       <w:cols w:space="720"/>
       <w:docGrid w:linePitch="360"/>
     </w:sectPr>
+    <w:p>
+      <w:pPr>
+        <w:ind w:firstLine="420"/>
+      </w:pPr>
+      <w:r>
+        <w:rPr>
+          <w:rFonts w:ascii="Times New Roman" w:hAnsi="Times New Roman" w:eastAsia="宋体"/>
+          <w:b w:val="0"/>
+          <w:sz w:val="24"/>
+        </w:rPr>
+        <w:t>本人作为 ______________ 的法人,承诺本项目投标活动不存在围标串标行为。</w:t>
+      </w:r>
+    </w:p>
+    <w:p>
+      <w:pPr>
+        <w:ind w:firstLine="420"/>
+      </w:pPr>
+      <w:r>
+        <w:rPr>
+          <w:rFonts w:ascii="Times New Roman" w:hAnsi="Times New Roman" w:eastAsia="宋体"/>
+          <w:b w:val="0"/>
+          <w:sz w:val="24"/>
+        </w:rPr>
+        <w:t>项目编号:DEMO-2026-001</w:t>
+      </w:r>
+    </w:p>
+    <w:p>
+      <w:pPr>
+        <w:ind w:firstLine="420"/>
+      </w:pPr>
+      <w:r>
+        <w:rPr>
+          <w:rFonts w:ascii="Times New Roman" w:hAnsi="Times New Roman" w:eastAsia="宋体"/>
+          <w:b w:val="0"/>
+          <w:sz w:val="24"/>
+        </w:rPr>
+        <w:t>供应商(电子签章):____________ 日期:____年__月__日</w:t>
+      </w:r>
+    </w:p>
+    <w:p>
+      <w:r>
+        <w:rPr>
+          <w:rFonts w:ascii="Times New Roman" w:hAnsi="Times New Roman" w:eastAsia="宋体"/>
+          <w:b w:val="0"/>
+          <w:sz w:val="24"/>
+        </w:rPr>
+      </w:r>
+    </w:p>
+    <w:p>
+      <w:r>
+        <w:rPr>
+          <w:rFonts w:ascii="Times New Roman" w:hAnsi="Times New Roman" w:eastAsia="宋体"/>
+          <w:b w:val="0"/>
+          <w:sz w:val="24"/>
+        </w:rPr>
+        <w:t>三、报价响应文件</w:t>
+      </w:r>
+    </w:p>
   </w:body>
 </w:document>
 </file>
@@ -419,12 +433,6 @@
     <w:name w:val="Normal"/>
     <w:qFormat/>
     <w:rsid w:val="00FC693F"/>
-    <w:rPr>
-      <w:rFonts w:ascii="Times New Roman" w:hAnsi="Times New Roman" w:eastAsia="宋体"/>
-      <w:b w:val="0"/>
-      <w:color w:val="000000"/>
-      <w:sz w:val="28"/>
-    </w:rPr>
   </w:style>
   <w:style w:type="paragraph" w:styleId="Header">
     <w:name w:val="header"/>
@@ -485,11 +493,11 @@
       <w:outlineLvl w:val="0"/>
     </w:pPr>
     <w:rPr>
-      <w:rFonts w:asciiTheme="majorHAnsi" w:eastAsiaTheme="majorEastAsia" w:hAnsiTheme="majorHAnsi" w:cstheme="majorBidi" w:ascii="Times New Roman" w:hAnsi="Times New Roman" w:eastAsia="黑体"/>
+      <w:rFonts w:asciiTheme="majorHAnsi" w:eastAsiaTheme="majorEastAsia" w:hAnsiTheme="majorHAnsi" w:cstheme="majorBidi"/>
       <w:b/>
       <w:bCs/>
-      <w:color w:val="000000"/>
-      <w:sz w:val="32"/>
+      <w:color w:val="365F91" w:themeColor="accent1" w:themeShade="BF"/>
+      <w:sz w:val="28"/>
       <w:szCs w:val="28"/>
     </w:rPr>
   </w:style>
@@ -509,11 +517,11 @@
       <w:outlineLvl w:val="1"/>
     </w:pPr>
     <w:rPr>
-      <w:rFonts w:asciiTheme="majorHAnsi" w:eastAsiaTheme="majorEastAsia" w:hAnsiTheme="majorHAnsi" w:cstheme="majorBidi" w:ascii="Times New Roman" w:hAnsi="Times New Roman" w:eastAsia="黑体"/>
+      <w:rFonts w:asciiTheme="majorHAnsi" w:eastAsiaTheme="majorEastAsia" w:hAnsiTheme="majorHAnsi" w:cstheme="majorBidi"/>
       <w:b/>
       <w:bCs/>
-      <w:color w:val="000000"/>
-      <w:sz w:val="30"/>
+      <w:color w:val="4F81BD" w:themeColor="accent1"/>
+      <w:sz w:val="26"/>
       <w:szCs w:val="26"/>
     </w:rPr>
   </w:style>
@@ -533,11 +541,10 @@
       <w:outlineLvl w:val="2"/>
     </w:pPr>
     <w:rPr>
-      <w:rFonts w:asciiTheme="majorHAnsi" w:eastAsiaTheme="majorEastAsia" w:hAnsiTheme="majorHAnsi" w:cstheme="majorBidi" w:ascii="Times New Roman" w:hAnsi="Times New Roman" w:eastAsia="黑体"/>
+      <w:rFonts w:asciiTheme="majorHAnsi" w:eastAsiaTheme="majorEastAsia" w:hAnsiTheme="majorHAnsi" w:cstheme="majorBidi"/>
       <w:b/>
       <w:bCs/>
-      <w:color w:val="000000"/>
-      <w:sz w:val="28"/>
+      <w:color w:val="4F81BD" w:themeColor="accent1"/>
     </w:rPr>
   </w:style>
   <w:style w:type="paragraph" w:styleId="Heading4">
@@ -557,13 +564,12 @@
       <w:outlineLvl w:val="3"/>
     </w:pPr>
     <w:rPr>
-      <w:rFonts w:asciiTheme="majorHAnsi" w:eastAsiaTheme="majorEastAsia" w:hAnsiTheme="majorHAnsi" w:cstheme="majorBidi" w:ascii="Times New Roman" w:hAnsi="Times New Roman" w:eastAsia="黑体"/>
+      <w:rFonts w:asciiTheme="majorHAnsi" w:eastAsiaTheme="majorEastAsia" w:hAnsiTheme="majorHAnsi" w:cstheme="majorBidi"/>
       <w:b/>
       <w:bCs/>
       <w:i/>
       <w:iCs/>
-      <w:color w:val="000000"/>
-      <w:sz w:val="24"/>
+      <w:color w:val="4F81BD" w:themeColor="accent1"/>
     </w:rPr>
   </w:style>
   <w:style w:type="paragraph" w:styleId="Heading5">

</xml_diff>